<commit_message>
docs: régénère les exports .docx / .pdf de la documentation technique
Reprend les corrections du .md : CI backend sur H2 et CI frontend, bouton Authorize
de Swagger UI, 35 tests backend (OpenApiConfigTest), déclenchement manuel de l'email
de la capture §7.10.

Co-Authored-By: Claude Opus 5.5 <noreply@anthropic.com>
</commit_message>
<xml_diff>
--- a/docs/documentation-technique.docx
+++ b/docs/documentation-technique.docx
@@ -815,7 +815,25 @@
               <w:pStyle w:val="Compact"/>
             </w:pPr>
             <w:r>
-              <w:t>GitHub Actions (compilation, tests, packaging)</w:t>
+              <w:t xml:space="preserve">GitHub Actions : </w:t>
+            </w:r>
+            <w:r>
+              <w:rPr>
+                <w:rStyle w:val="VerbatimChar"/>
+              </w:rPr>
+              <w:t>ci-backend.yml</w:t>
+            </w:r>
+            <w:r>
+              <w:t xml:space="preserve"> (compilation, tests sur H2, packaging) et </w:t>
+            </w:r>
+            <w:r>
+              <w:rPr>
+                <w:rStyle w:val="VerbatimChar"/>
+              </w:rPr>
+              <w:t>ci-frontend.yml</w:t>
+            </w:r>
+            <w:r>
+              <w:t xml:space="preserve"> (Node 22, tests Vitest, build Angular)</w:t>
             </w:r>
           </w:p>
         </w:tc>
@@ -886,7 +904,6 @@
         <w:rPr>
           <w:noProof/>
         </w:rPr>
-        <w:lastRenderedPageBreak/>
         <w:drawing>
           <wp:inline distT="0" distB="0" distL="0" distR="0" wp14:anchorId="53AC638E" wp14:editId="17742457">
             <wp:extent cx="5334000" cy="13679540"/>
@@ -935,7 +952,6 @@
         <w:pStyle w:val="ImageCaption"/>
       </w:pPr>
       <w:r>
-        <w:lastRenderedPageBreak/>
         <w:t>Diagramme</w:t>
       </w:r>
     </w:p>
@@ -1555,7 +1571,6 @@
       </w:pPr>
       <w:bookmarkStart w:id="9" w:name="_ceadf566b066996380229d55c2ad34c8ec3a3c3"/>
       <w:r>
-        <w:lastRenderedPageBreak/>
         <w:t>2.3 Organisation du frontend</w:t>
       </w:r>
       <w:bookmarkEnd w:id="9"/>
@@ -1922,7 +1937,6 @@
         </w:numPr>
       </w:pPr>
       <w:r>
-        <w:lastRenderedPageBreak/>
         <w:t>Les guards (</w:t>
       </w:r>
       <w:r>
@@ -2017,7 +2031,6 @@
       </w:pPr>
       <w:bookmarkStart w:id="10" w:name="_1eadf5a3b96c0169a65f72ec30356cb4a48fa1f"/>
       <w:r>
-        <w:lastRenderedPageBreak/>
         <w:t>3. Modèle de données</w:t>
       </w:r>
       <w:bookmarkEnd w:id="10"/>
@@ -2067,7 +2080,6 @@
         <w:rPr>
           <w:noProof/>
         </w:rPr>
-        <w:lastRenderedPageBreak/>
         <w:drawing>
           <wp:inline distT="0" distB="0" distL="0" distR="0" wp14:anchorId="15F5DE5C" wp14:editId="14602C0B">
             <wp:extent cx="5334000" cy="8143875"/>
@@ -2116,7 +2128,6 @@
         <w:pStyle w:val="ImageCaption"/>
       </w:pPr>
       <w:r>
-        <w:lastRenderedPageBreak/>
         <w:t>Diagramme</w:t>
       </w:r>
     </w:p>
@@ -2767,7 +2778,6 @@
       </w:pPr>
       <w:bookmarkStart w:id="13" w:name="_a6aeae45396bc363d2b171c1cc32d129fecc389"/>
       <w:r>
-        <w:lastRenderedPageBreak/>
         <w:t>4. Sécurité et gestion des rôles</w:t>
       </w:r>
       <w:bookmarkEnd w:id="13"/>
@@ -2953,9 +2963,89 @@
     </w:p>
     <w:p>
       <w:pPr>
+        <w:pStyle w:val="Corpsdetexte"/>
+      </w:pPr>
+      <w:bookmarkStart w:id="15" w:name="_f4e1fec89de6710335a971f73438b2565286b33"/>
+      <w:r>
+        <w:t>Swagger UI (</w:t>
+      </w:r>
+      <w:r>
+        <w:rPr>
+          <w:rStyle w:val="VerbatimChar"/>
+        </w:rPr>
+        <w:t>/swagger-ui/index.html</w:t>
+      </w:r>
+      <w:r>
+        <w:t xml:space="preserve">) prend en charge ce token : </w:t>
+      </w:r>
+      <w:r>
+        <w:rPr>
+          <w:rStyle w:val="VerbatimChar"/>
+        </w:rPr>
+        <w:t>OpenApiConfig</w:t>
+      </w:r>
+      <w:r>
+        <w:t xml:space="preserve"> déclare un schéma de sécurité </w:t>
+      </w:r>
+      <w:r>
+        <w:rPr>
+          <w:rStyle w:val="VerbatimChar"/>
+        </w:rPr>
+        <w:t>bearerAuth</w:t>
+      </w:r>
+      <w:r>
+        <w:t xml:space="preserve"> (HTTP, bearer, JWT) appliqué à toute l'API. Le bouton « Authorize » permet de coller le token renvoyé par </w:t>
+      </w:r>
+      <w:r>
+        <w:rPr>
+          <w:rStyle w:val="VerbatimChar"/>
+        </w:rPr>
+        <w:t>/auth/login</w:t>
+      </w:r>
+      <w:r>
+        <w:t xml:space="preserve">, qui est ensuite envoyé dans l'en-tête </w:t>
+      </w:r>
+      <w:r>
+        <w:rPr>
+          <w:rStyle w:val="VerbatimChar"/>
+        </w:rPr>
+        <w:t>Authorization</w:t>
+      </w:r>
+      <w:r>
+        <w:t xml:space="preserve"> de chaque requête de test. </w:t>
+      </w:r>
+      <w:r>
+        <w:rPr>
+          <w:rStyle w:val="VerbatimChar"/>
+        </w:rPr>
+        <w:t>POST /auth/login</w:t>
+      </w:r>
+      <w:r>
+        <w:t xml:space="preserve"> en est exempté (</w:t>
+      </w:r>
+      <w:r>
+        <w:rPr>
+          <w:rStyle w:val="VerbatimChar"/>
+        </w:rPr>
+        <w:t>@SecurityRequirements</w:t>
+      </w:r>
+      <w:r>
+        <w:t xml:space="preserve"> vide), puisqu'il sert à obtenir ce token. Les règles d'accès réelles restent celles de </w:t>
+      </w:r>
+      <w:r>
+        <w:rPr>
+          <w:rStyle w:val="VerbatimChar"/>
+        </w:rPr>
+        <w:t>SecurityConfig</w:t>
+      </w:r>
+      <w:r>
+        <w:t xml:space="preserve"> (§4.2).</w:t>
+      </w:r>
+    </w:p>
+    <w:p>
+      <w:pPr>
         <w:pStyle w:val="Titre3"/>
       </w:pPr>
-      <w:bookmarkStart w:id="15" w:name="_f4e1fec89de6710335a971f73438b2565286b33"/>
       <w:r>
         <w:t>4.2 Rôles applicatifs</w:t>
       </w:r>
@@ -3753,47 +3843,51 @@
               <w:t>DELETE</w:t>
             </w:r>
             <w:r>
+              <w:t>, traité en 3)</w:t>
+            </w:r>
+          </w:p>
+        </w:tc>
+        <w:tc>
+          <w:tcPr>
+            <w:tcW w:w="0" w:type="auto"/>
+          </w:tcPr>
+          <w:p>
+            <w:pPr>
+              <w:pStyle w:val="Compact"/>
+            </w:pPr>
+            <w:r>
+              <w:rPr>
+                <w:rStyle w:val="VerbatimChar"/>
+              </w:rPr>
+              <w:t>/api/commandes/**</w:t>
+            </w:r>
+            <w:r>
+              <w:t xml:space="preserve"> (liste, création, annulation, facture PDF)</w:t>
+            </w:r>
+          </w:p>
+        </w:tc>
+        <w:tc>
+          <w:tcPr>
+            <w:tcW w:w="0" w:type="auto"/>
+          </w:tcPr>
+          <w:p>
+            <w:pPr>
+              <w:pStyle w:val="Compact"/>
+            </w:pPr>
+            <w:r>
+              <w:rPr>
+                <w:rStyle w:val="VerbatimChar"/>
+              </w:rPr>
+              <w:t>ADMIN</w:t>
+            </w:r>
+            <w:r>
               <w:t xml:space="preserve">, </w:t>
             </w:r>
             <w:r>
-              <w:lastRenderedPageBreak/>
-              <w:t>traité en 3)</w:t>
-            </w:r>
-          </w:p>
-        </w:tc>
-        <w:tc>
-          <w:tcPr>
-            <w:tcW w:w="0" w:type="auto"/>
-          </w:tcPr>
-          <w:p>
-            <w:pPr>
-              <w:pStyle w:val="Compact"/>
-            </w:pPr>
-            <w:r>
-              <w:rPr>
-                <w:rStyle w:val="VerbatimChar"/>
-              </w:rPr>
-              <w:lastRenderedPageBreak/>
-              <w:t>/api/commandes/**</w:t>
-            </w:r>
-            <w:r>
-              <w:t xml:space="preserve"> (liste, création, annulation, facture PDF)</w:t>
-            </w:r>
-          </w:p>
-        </w:tc>
-        <w:tc>
-          <w:tcPr>
-            <w:tcW w:w="0" w:type="auto"/>
-          </w:tcPr>
-          <w:p>
-            <w:pPr>
-              <w:pStyle w:val="Compact"/>
-            </w:pPr>
-            <w:r>
-              <w:rPr>
-                <w:rStyle w:val="VerbatimChar"/>
-              </w:rPr>
-              <w:t>ADMIN</w:t>
+              <w:rPr>
+                <w:rStyle w:val="VerbatimChar"/>
+              </w:rPr>
+              <w:t>GESTIONNAIRE</w:t>
             </w:r>
             <w:r>
               <w:t xml:space="preserve">, </w:t>
@@ -3802,16 +3896,6 @@
               <w:rPr>
                 <w:rStyle w:val="VerbatimChar"/>
               </w:rPr>
-              <w:t>GESTIONNAIRE</w:t>
-            </w:r>
-            <w:r>
-              <w:t xml:space="preserve">, </w:t>
-            </w:r>
-            <w:r>
-              <w:rPr>
-                <w:rStyle w:val="VerbatimChar"/>
-              </w:rPr>
-              <w:lastRenderedPageBreak/>
               <w:t>CAISSIER</w:t>
             </w:r>
           </w:p>
@@ -3827,7 +3911,6 @@
               <w:pStyle w:val="Compact"/>
             </w:pPr>
             <w:r>
-              <w:lastRenderedPageBreak/>
               <w:t>9</w:t>
             </w:r>
           </w:p>
@@ -3924,7 +4007,6 @@
           <w:b/>
           <w:bCs/>
         </w:rPr>
-        <w:lastRenderedPageBreak/>
         <w:t>Illustration — tentative d'accès à une route non autorisée</w:t>
       </w:r>
     </w:p>
@@ -4037,7 +4119,6 @@
       </w:pPr>
       <w:bookmarkStart w:id="16" w:name="_a20600e0cc25be192792887fe3f399f496f5480"/>
       <w:r>
-        <w:lastRenderedPageBreak/>
         <w:t>4.3 Traçabilité</w:t>
       </w:r>
       <w:bookmarkEnd w:id="16"/>
@@ -4598,7 +4679,6 @@
       </w:pPr>
       <w:bookmarkStart w:id="19" w:name="_b5d4adec3137827518dbcb513eb221171bf9c66"/>
       <w:r>
-        <w:lastRenderedPageBreak/>
         <w:t>5.1 Authentification (connexion et accès à une ressource protégée)</w:t>
       </w:r>
       <w:bookmarkEnd w:id="19"/>
@@ -4737,7 +4817,6 @@
       </w:pPr>
       <w:bookmarkStart w:id="21" w:name="_7ab31d629c9a0953076646e88dfee6bdb2a14b7"/>
       <w:r>
-        <w:lastRenderedPageBreak/>
         <w:t>5.3 Annulation d'une commande client (restitution du stock)</w:t>
       </w:r>
       <w:bookmarkEnd w:id="21"/>
@@ -4899,7 +4978,6 @@
         <w:rPr>
           <w:rStyle w:val="VerbatimChar"/>
         </w:rPr>
-        <w:lastRenderedPageBreak/>
         <w:t>VALIDEE</w:t>
       </w:r>
       <w:r>
@@ -5083,7 +5161,6 @@
       </w:pPr>
       <w:bookmarkStart w:id="25" w:name="_8cbfeb4aa7e7af72c267e6dd30769a2b4f6f837"/>
       <w:r>
-        <w:lastRenderedPageBreak/>
         <w:t>5.7 Alerte de stock quotidienne par email</w:t>
       </w:r>
       <w:bookmarkEnd w:id="25"/>
@@ -5179,7 +5256,6 @@
       </w:pPr>
       <w:bookmarkStart w:id="26" w:name="_c0f8e6fc4d7595d8662b4f5ab528e54aa3351f1"/>
       <w:r>
-        <w:lastRenderedPageBreak/>
         <w:t>5.8 Archivage de la facture PDF côté serveur</w:t>
       </w:r>
       <w:bookmarkEnd w:id="26"/>
@@ -5264,7 +5340,6 @@
       </w:pPr>
       <w:bookmarkStart w:id="27" w:name="_7e541b32afb701afd497b315b2a20f19aa41fab"/>
       <w:r>
-        <w:lastRenderedPageBreak/>
         <w:t>6. Diagramme d'activité — cycle de vente et de réapprovisionnement</w:t>
       </w:r>
       <w:bookmarkEnd w:id="27"/>
@@ -5286,7 +5361,6 @@
         <w:rPr>
           <w:noProof/>
         </w:rPr>
-        <w:lastRenderedPageBreak/>
         <w:drawing>
           <wp:inline distT="0" distB="0" distL="0" distR="0" wp14:anchorId="3569FA61" wp14:editId="3DB71E00">
             <wp:extent cx="5334000" cy="28478275"/>
@@ -5335,7 +5409,6 @@
         <w:pStyle w:val="ImageCaption"/>
       </w:pPr>
       <w:r>
-        <w:lastRenderedPageBreak/>
         <w:t>Diagramme</w:t>
       </w:r>
     </w:p>
@@ -5489,7 +5562,6 @@
       </w:pPr>
       <w:bookmarkStart w:id="30" w:name="_0d76cf150681b2e6363b542f9250c6f2232e357"/>
       <w:r>
-        <w:lastRenderedPageBreak/>
         <w:t>7.2 Tableau de bord</w:t>
       </w:r>
       <w:bookmarkEnd w:id="30"/>
@@ -5691,7 +5763,6 @@
           <w:b/>
           <w:bCs/>
         </w:rPr>
-        <w:lastRenderedPageBreak/>
         <w:t>Graphiques et alertes de stock</w:t>
       </w:r>
     </w:p>
@@ -5806,7 +5877,6 @@
       </w:pPr>
       <w:bookmarkStart w:id="31" w:name="_0b79b4f2367e57366f82d1112de638b05abdc46"/>
       <w:r>
-        <w:lastRenderedPageBreak/>
         <w:t>7.3 Gestion des clients</w:t>
       </w:r>
       <w:bookmarkEnd w:id="31"/>
@@ -5968,11 +6038,7 @@
         <w:pStyle w:val="FirstParagraph"/>
       </w:pPr>
       <w:r>
-        <w:t xml:space="preserve">Formulaire client réutilisé à l'identique pour la création et la modification, avec validations en temps réel (nom et prénom obligatoires, format d'email, téléphone à exactement 10 chiffres). Le message de succès en tête de page (« Client mis à jour avec succès ! ») confirme l'action ; les messages d'erreur sous chaque champ apparaissent uniquement si la validation échoue. Les mêmes règles sont appliquées côté serveur (voir §4.4). Le formulaire </w:t>
-      </w:r>
-      <w:r>
-        <w:lastRenderedPageBreak/>
-        <w:t xml:space="preserve">n'est affiché qu'aux rôles </w:t>
+        <w:t xml:space="preserve">Formulaire client réutilisé à l'identique pour la création et la modification, avec validations en temps réel (nom et prénom obligatoires, format d'email, téléphone à exactement 10 chiffres). Le message de succès en tête de page (« Client mis à jour avec succès ! ») confirme l'action ; les messages d'erreur sous chaque champ apparaissent uniquement si la validation échoue. Les mêmes règles sont appliquées côté serveur (voir §4.4). Le formulaire n'est affiché qu'aux rôles </w:t>
       </w:r>
       <w:r>
         <w:rPr>
@@ -6204,11 +6270,7 @@
         <w:t>caissier</w:t>
       </w:r>
       <w:r>
-        <w:t xml:space="preserve">. La barre de navigation ne propose que les onglets Clients, Produits et Commandes (pas de tableau de bord, de fournisseurs, d'achats ni de journal d'audit). Le formulaire « Nouveau client » et la colonne Action sont </w:t>
-      </w:r>
-      <w:r>
-        <w:lastRenderedPageBreak/>
-        <w:t>absents : le caissier recherche, consulte et exporte la liste, mais ne peut ni créer, ni modifier, ni supprimer un client, conformément aux règles du serveur (§4.2).</w:t>
+        <w:t>. La barre de navigation ne propose que les onglets Clients, Produits et Commandes (pas de tableau de bord, de fournisseurs, d'achats ni de journal d'audit). Le formulaire « Nouveau client » et la colonne Action sont absents : le caissier recherche, consulte et exporte la liste, mais ne peut ni créer, ni modifier, ni supprimer un client, conformément aux règles du serveur (§4.2).</w:t>
       </w:r>
     </w:p>
     <w:p>
@@ -6409,7 +6471,6 @@
           <w:b/>
           <w:bCs/>
         </w:rPr>
-        <w:lastRenderedPageBreak/>
         <w:t>Formulaire — modification</w:t>
       </w:r>
     </w:p>
@@ -6579,7 +6640,6 @@
           <w:b/>
           <w:bCs/>
         </w:rPr>
-        <w:lastRenderedPageBreak/>
         <w:t>Liste des produits</w:t>
       </w:r>
     </w:p>
@@ -6870,7 +6930,6 @@
           <w:b/>
           <w:bCs/>
         </w:rPr>
-        <w:lastRenderedPageBreak/>
         <w:t>Liste des produits — vue caissier</w:t>
       </w:r>
     </w:p>
@@ -6883,7 +6942,7 @@
           <w:noProof/>
         </w:rPr>
         <w:drawing>
-          <wp:inline distT="0" distB="0" distL="0" distR="0" wp14:anchorId="7A8D62EF" wp14:editId="0A365C71">
+          <wp:inline distT="0" distB="0" distL="0" distR="0" wp14:anchorId="7A8D62EF" wp14:editId="0E11DC69">
             <wp:extent cx="5334000" cy="2268906"/>
             <wp:effectExtent l="0" t="0" r="0" b="0"/>
             <wp:docPr id="1108472297" name="Image 1" descr="Liste des produits vue caissier"/>
@@ -7049,7 +7108,6 @@
           <w:b/>
           <w:bCs/>
         </w:rPr>
-        <w:lastRenderedPageBreak/>
         <w:t>Liste des commandes et facturation</w:t>
       </w:r>
     </w:p>
@@ -7270,7 +7328,6 @@
       </w:pPr>
       <w:bookmarkStart w:id="35" w:name="_5975cb26d92caeb229313bc7acd26b08588ea94"/>
       <w:r>
-        <w:lastRenderedPageBreak/>
         <w:t>7.7 Fournisseurs</w:t>
       </w:r>
       <w:bookmarkEnd w:id="35"/>
@@ -7545,7 +7602,6 @@
           <w:b/>
           <w:bCs/>
         </w:rPr>
-        <w:lastRenderedPageBreak/>
         <w:t>Liste des fournisseurs — vue gestionnaire</w:t>
       </w:r>
     </w:p>
@@ -7558,7 +7614,7 @@
           <w:noProof/>
         </w:rPr>
         <w:drawing>
-          <wp:inline distT="0" distB="0" distL="0" distR="0" wp14:anchorId="3BE33F28" wp14:editId="32448886">
+          <wp:inline distT="0" distB="0" distL="0" distR="0" wp14:anchorId="3BE33F28" wp14:editId="08039FB0">
             <wp:extent cx="5334000" cy="1684242"/>
             <wp:effectExtent l="0" t="0" r="0" b="0"/>
             <wp:docPr id="783165910" name="Image 1" descr="Liste des fournisseurs vue gestionnaire"/>
@@ -7784,7 +7840,6 @@
         <w:pStyle w:val="FirstParagraph"/>
       </w:pPr>
       <w:r>
-        <w:lastRenderedPageBreak/>
         <w:t xml:space="preserve">Sélection du fournisseur, ajout de produits avec quantité et </w:t>
       </w:r>
       <w:r>
@@ -7955,7 +8010,6 @@
       </w:pPr>
       <w:bookmarkStart w:id="37" w:name="_5e87025747a18e261c6abce4835a7065e163500"/>
       <w:r>
-        <w:lastRenderedPageBreak/>
         <w:t>7.9 Journal d'audit</w:t>
       </w:r>
       <w:bookmarkEnd w:id="37"/>
@@ -8144,7 +8198,6 @@
         <w:pStyle w:val="FirstParagraph"/>
       </w:pPr>
       <w:r>
-        <w:lastRenderedPageBreak/>
         <w:t xml:space="preserve">Onglet Réseau des outils de développement du navigateur, montrant l'en-tête </w:t>
       </w:r>
       <w:r>
@@ -8342,7 +8395,6 @@
           <w:b/>
           <w:bCs/>
         </w:rPr>
-        <w:lastRenderedPageBreak/>
         <w:t>Alerte de stock reçue par email</w:t>
       </w:r>
     </w:p>
@@ -8410,7 +8462,25 @@
         <w:pStyle w:val="FirstParagraph"/>
       </w:pPr>
       <w:r>
-        <w:t xml:space="preserve">Email réellement reçu, déclenché par le job planifié quotidien (voir §5.7). Il applique les seuils partagés </w:t>
+        <w:t xml:space="preserve">Email réellement reçu. Pour la capture, il a été déclenché manuellement par </w:t>
+      </w:r>
+      <w:r>
+        <w:rPr>
+          <w:rStyle w:val="VerbatimChar"/>
+        </w:rPr>
+        <w:t>POST /api/notifications/test-alerte-stock</w:t>
+      </w:r>
+      <w:r>
+        <w:t xml:space="preserve"> (réservé au rôle </w:t>
+      </w:r>
+      <w:r>
+        <w:rPr>
+          <w:rStyle w:val="VerbatimChar"/>
+        </w:rPr>
+        <w:t>ADMIN</w:t>
+      </w:r>
+      <w:r>
+        <w:t xml:space="preserve">), et non par le job planifié quotidien : le contenu est le même que celui envoyé chaque matin (voir §5.7). Il applique les seuils partagés </w:t>
       </w:r>
       <w:r>
         <w:rPr>
@@ -8689,11 +8759,7 @@
               <w:t>home.spec.ts</w:t>
             </w:r>
             <w:r>
-              <w:t xml:space="preserve">), </w:t>
-            </w:r>
-            <w:r>
-              <w:lastRenderedPageBreak/>
-              <w:t>couleur du badge de stock selon les seuils (</w:t>
+              <w:t>), couleur du badge de stock selon les seuils (</w:t>
             </w:r>
             <w:r>
               <w:rPr>
@@ -8726,7 +8792,6 @@
           <w:b/>
           <w:bCs/>
         </w:rPr>
-        <w:lastRenderedPageBreak/>
         <w:t>Classes de tests backend :</w:t>
       </w:r>
     </w:p>
@@ -8971,6 +9036,80 @@
           </w:p>
         </w:tc>
       </w:tr>
+      <w:tr>
+        <w:tc>
+          <w:tcPr>
+            <w:tcW w:w="0" w:type="auto"/>
+          </w:tcPr>
+          <w:p>
+            <w:pPr>
+              <w:pStyle w:val="Compact"/>
+              <w:rPr>
+                <w:rStyle w:val="VerbatimChar"/>
+              </w:rPr>
+            </w:pPr>
+            <w:r>
+              <w:rPr>
+                <w:rStyle w:val="VerbatimChar"/>
+              </w:rPr>
+              <w:t>OpenApiConfigTest</w:t>
+            </w:r>
+          </w:p>
+        </w:tc>
+        <w:tc>
+          <w:tcPr>
+            <w:tcW w:w="0" w:type="auto"/>
+          </w:tcPr>
+          <w:p>
+            <w:pPr>
+              <w:pStyle w:val="Compact"/>
+            </w:pPr>
+            <w:r>
+              <w:t>1</w:t>
+            </w:r>
+          </w:p>
+        </w:tc>
+        <w:tc>
+          <w:tcPr>
+            <w:tcW w:w="0" w:type="auto"/>
+          </w:tcPr>
+          <w:p>
+            <w:pPr>
+              <w:pStyle w:val="Compact"/>
+            </w:pPr>
+            <w:r>
+              <w:t>Documentation OpenAPI (</w:t>
+            </w:r>
+            <w:r>
+              <w:rPr>
+                <w:rStyle w:val="VerbatimChar"/>
+              </w:rPr>
+              <w:t>/v3/api-docs</w:t>
+            </w:r>
+            <w:r>
+              <w:t xml:space="preserve">) accessible sans token, schéma </w:t>
+            </w:r>
+            <w:r>
+              <w:rPr>
+                <w:rStyle w:val="VerbatimChar"/>
+              </w:rPr>
+              <w:t>bearerAuth</w:t>
+            </w:r>
+            <w:r>
+              <w:t xml:space="preserve"> (HTTP, bearer, JWT) appliqué à l'API, </w:t>
+            </w:r>
+            <w:r>
+              <w:rPr>
+                <w:rStyle w:val="VerbatimChar"/>
+              </w:rPr>
+              <w:t>POST /auth/login</w:t>
+            </w:r>
+            <w:r>
+              <w:t xml:space="preserve"> exempté (voir §4.1)</w:t>
+            </w:r>
+          </w:p>
+        </w:tc>
+      </w:tr>
     </w:tbl>
     <w:p>
       <w:pPr>
@@ -8986,7 +9125,7 @@
         <w:t>mvn test</w:t>
       </w:r>
       <w:r>
-        <w:t xml:space="preserve">), la suite backend passe : 34 tests, tous au vert. Ce total inclut aussi </w:t>
+        <w:t xml:space="preserve">), la suite backend passe : 35 tests, tous au vert. Ce total inclut aussi </w:t>
       </w:r>
       <w:r>
         <w:rPr>
@@ -9023,6 +9162,59 @@
       </w:r>
       <w:r>
         <w:t>), la suite passe également : 15 fichiers de tests, 58 tests, tous au vert.</w:t>
+      </w:r>
+    </w:p>
+    <w:p>
+      <w:pPr>
+        <w:pStyle w:val="FirstParagraph"/>
+      </w:pPr>
+      <w:r>
+        <w:t xml:space="preserve">Les deux suites sont rejouées par GitHub Actions à chaque push et pull request vers </w:t>
+      </w:r>
+      <w:r>
+        <w:rPr>
+          <w:rStyle w:val="VerbatimChar"/>
+        </w:rPr>
+        <w:t>main</w:t>
+      </w:r>
+      <w:r>
+        <w:t xml:space="preserve"> : </w:t>
+      </w:r>
+      <w:r>
+        <w:rPr>
+          <w:rStyle w:val="VerbatimChar"/>
+        </w:rPr>
+        <w:t>ci-backend.yml</w:t>
+      </w:r>
+      <w:r>
+        <w:t xml:space="preserve"> lance </w:t>
+      </w:r>
+      <w:r>
+        <w:rPr>
+          <w:rStyle w:val="VerbatimChar"/>
+        </w:rPr>
+        <w:t>./mvnw test</w:t>
+      </w:r>
+      <w:r>
+        <w:t xml:space="preserve"> sur la base H2 en mémoire, puis le packaging ; </w:t>
+      </w:r>
+      <w:r>
+        <w:rPr>
+          <w:rStyle w:val="VerbatimChar"/>
+        </w:rPr>
+        <w:t>ci-frontend.yml</w:t>
+      </w:r>
+      <w:r>
+        <w:t xml:space="preserve"> installe les dépendances (</w:t>
+      </w:r>
+      <w:r>
+        <w:rPr>
+          <w:rStyle w:val="VerbatimChar"/>
+        </w:rPr>
+        <w:t>npm ci</w:t>
+      </w:r>
+      <w:r>
+        <w:t>) sous Node 22, lance les tests Vitest, puis le build de production Angular.</w:t>
       </w:r>
     </w:p>
     <w:p>
@@ -9133,11 +9325,7 @@
         <w:t>Double génération de la facture PDF</w:t>
       </w:r>
       <w:r>
-        <w:t xml:space="preserve"> : une génération côté client (jsPDF), pour un téléchargement immédiat sans aller-retour serveur au moment de la vente, et une </w:t>
-      </w:r>
-      <w:r>
-        <w:lastRenderedPageBreak/>
-        <w:t>génération côté serveur (OpenPDF), déclenchée automatiquement et archivée sur le disque, pour garantir qu'un document existe et reste consultable même si la facture n'a jamais été téléchargée. Les deux répondent à des besoins différents plutôt que de faire doublon : l'une est un confort d'usage, l'autre une garantie d'archivage.</w:t>
+        <w:t xml:space="preserve"> : une génération côté client (jsPDF), pour un téléchargement immédiat sans aller-retour serveur au moment de la vente, et une génération côté serveur (OpenPDF), déclenchée automatiquement et archivée sur le disque, pour garantir qu'un document existe et reste consultable même si la facture n'a jamais été téléchargée. Les deux répondent à des besoins différents plutôt que de faire doublon : l'une est un confort d'usage, l'autre une garantie d'archivage.</w:t>
       </w:r>
     </w:p>
     <w:p>

</xml_diff>

<commit_message>
docs: documente ALERTE_STOCK_EXPEDITEUR, le format des montants et la nouvelle capture d'audit
- README : variable ALERTE_STOCK_EXPEDITEUR dans la section Configuration
- Documentation technique : expéditeur de l'alerte (§5.7), format des montants (§4.3),
  39 tests backend (§7.11) ; exports .docx / .pdf régénérés
- Capture du journal d'audit remplacée (2026-10-22 153942)

Co-Authored-By: Claude Opus 5.5 <noreply@anthropic.com>
</commit_message>
<xml_diff>
--- a/docs/documentation-technique.docx
+++ b/docs/documentation-technique.docx
@@ -904,6 +904,7 @@
         <w:rPr>
           <w:noProof/>
         </w:rPr>
+        <w:lastRenderedPageBreak/>
         <w:drawing>
           <wp:inline distT="0" distB="0" distL="0" distR="0" wp14:anchorId="53AC638E" wp14:editId="17742457">
             <wp:extent cx="5334000" cy="13679540"/>
@@ -952,6 +953,7 @@
         <w:pStyle w:val="ImageCaption"/>
       </w:pPr>
       <w:r>
+        <w:lastRenderedPageBreak/>
         <w:t>Diagramme</w:t>
       </w:r>
     </w:p>
@@ -1571,6 +1573,7 @@
       </w:pPr>
       <w:bookmarkStart w:id="9" w:name="_ceadf566b066996380229d55c2ad34c8ec3a3c3"/>
       <w:r>
+        <w:lastRenderedPageBreak/>
         <w:t>2.3 Organisation du frontend</w:t>
       </w:r>
       <w:bookmarkEnd w:id="9"/>
@@ -1937,6 +1940,7 @@
         </w:numPr>
       </w:pPr>
       <w:r>
+        <w:lastRenderedPageBreak/>
         <w:t>Les guards (</w:t>
       </w:r>
       <w:r>
@@ -2031,6 +2035,7 @@
       </w:pPr>
       <w:bookmarkStart w:id="10" w:name="_1eadf5a3b96c0169a65f72ec30356cb4a48fa1f"/>
       <w:r>
+        <w:lastRenderedPageBreak/>
         <w:t>3. Modèle de données</w:t>
       </w:r>
       <w:bookmarkEnd w:id="10"/>
@@ -2080,6 +2085,7 @@
         <w:rPr>
           <w:noProof/>
         </w:rPr>
+        <w:lastRenderedPageBreak/>
         <w:drawing>
           <wp:inline distT="0" distB="0" distL="0" distR="0" wp14:anchorId="15F5DE5C" wp14:editId="14602C0B">
             <wp:extent cx="5334000" cy="8143875"/>
@@ -2128,6 +2134,7 @@
         <w:pStyle w:val="ImageCaption"/>
       </w:pPr>
       <w:r>
+        <w:lastRenderedPageBreak/>
         <w:t>Diagramme</w:t>
       </w:r>
     </w:p>
@@ -2778,6 +2785,7 @@
       </w:pPr>
       <w:bookmarkStart w:id="13" w:name="_a6aeae45396bc363d2b171c1cc32d129fecc389"/>
       <w:r>
+        <w:lastRenderedPageBreak/>
         <w:t>4. Sécurité et gestion des rôles</w:t>
       </w:r>
       <w:bookmarkEnd w:id="13"/>
@@ -3620,6 +3628,7 @@
               <w:pStyle w:val="Compact"/>
             </w:pPr>
             <w:r>
+              <w:lastRenderedPageBreak/>
               <w:t>6</w:t>
             </w:r>
           </w:p>
@@ -4007,6 +4016,7 @@
           <w:b/>
           <w:bCs/>
         </w:rPr>
+        <w:lastRenderedPageBreak/>
         <w:t>Illustration — tentative d'accès à une route non autorisée</w:t>
       </w:r>
     </w:p>
@@ -4119,6 +4129,7 @@
       </w:pPr>
       <w:bookmarkStart w:id="16" w:name="_a20600e0cc25be192792887fe3f399f496f5480"/>
       <w:r>
+        <w:lastRenderedPageBreak/>
         <w:t>4.3 Traçabilité</w:t>
       </w:r>
       <w:bookmarkEnd w:id="16"/>
@@ -4178,9 +4189,26 @@
     </w:p>
     <w:p>
       <w:pPr>
+        <w:pStyle w:val="FirstParagraph"/>
+      </w:pPr>
+      <w:bookmarkStart w:id="17" w:name="_82aec365ef63ab9647220db245e485886c1a60a"/>
+      <w:r>
+        <w:t xml:space="preserve">Les montants écrits dans le journal (et dans la facture PDF archivée côté serveur, §5.8) passent par </w:t>
+      </w:r>
+      <w:r>
+        <w:rPr>
+          <w:rStyle w:val="VerbatimChar"/>
+        </w:rPr>
+        <w:t>MontantFcfa.formater(...)</w:t>
+      </w:r>
+      <w:r>
+        <w:t xml:space="preserve"> : « 400 000 FCFA », sans décimales et milliers séparés par une espace, comme la facture générée côté client. Les ventes et les achats ont ainsi le même format, alors qu'auparavant une vente s'affichait « 400000.00 FCFA » (prix relus en base avec deux décimales) et un achat « 1500000 FCFA ». Les lignes déjà enregistrées avant ce changement gardent leur ancien format.</w:t>
+      </w:r>
+    </w:p>
+    <w:p>
+      <w:pPr>
         <w:pStyle w:val="Titre3"/>
       </w:pPr>
-      <w:bookmarkStart w:id="17" w:name="_82aec365ef63ab9647220db245e485886c1a60a"/>
       <w:r>
         <w:t>4.4 Validation des données</w:t>
       </w:r>
@@ -4661,6 +4689,7 @@
       </w:pPr>
       <w:bookmarkStart w:id="18" w:name="_65fd039df5331b53a023b25634f749577d00108"/>
       <w:r>
+        <w:lastRenderedPageBreak/>
         <w:t>5. Diagrammes de séquence</w:t>
       </w:r>
       <w:bookmarkEnd w:id="18"/>
@@ -4817,6 +4846,7 @@
       </w:pPr>
       <w:bookmarkStart w:id="21" w:name="_7ab31d629c9a0953076646e88dfee6bdb2a14b7"/>
       <w:r>
+        <w:lastRenderedPageBreak/>
         <w:t>5.3 Annulation d'une commande client (restitution du stock)</w:t>
       </w:r>
       <w:bookmarkEnd w:id="21"/>
@@ -4978,6 +5008,7 @@
         <w:rPr>
           <w:rStyle w:val="VerbatimChar"/>
         </w:rPr>
+        <w:lastRenderedPageBreak/>
         <w:t>VALIDEE</w:t>
       </w:r>
       <w:r>
@@ -5161,6 +5192,7 @@
       </w:pPr>
       <w:bookmarkStart w:id="25" w:name="_8cbfeb4aa7e7af72c267e6dd30769a2b4f6f837"/>
       <w:r>
+        <w:lastRenderedPageBreak/>
         <w:t>5.7 Alerte de stock quotidienne par email</w:t>
       </w:r>
       <w:bookmarkEnd w:id="25"/>
@@ -5252,10 +5284,82 @@
     </w:p>
     <w:p>
       <w:pPr>
+        <w:pStyle w:val="FirstParagraph"/>
+      </w:pPr>
+      <w:bookmarkStart w:id="26" w:name="_c0f8e6fc4d7595d8662b4f5ab528e54aa3351f1"/>
+      <w:r>
+        <w:t xml:space="preserve">Le destinataire est fixé par </w:t>
+      </w:r>
+      <w:r>
+        <w:rPr>
+          <w:rStyle w:val="VerbatimChar"/>
+        </w:rPr>
+        <w:t>ALERTE_STOCK_DESTINATAIRE</w:t>
+      </w:r>
+      <w:r>
+        <w:t xml:space="preserve"> (propriété </w:t>
+      </w:r>
+      <w:r>
+        <w:rPr>
+          <w:rStyle w:val="VerbatimChar"/>
+        </w:rPr>
+        <w:t>alerte.stock.destinataire</w:t>
+      </w:r>
+      <w:r>
+        <w:t xml:space="preserve">). L'expéditeur est optionnel : </w:t>
+      </w:r>
+      <w:r>
+        <w:rPr>
+          <w:rStyle w:val="VerbatimChar"/>
+        </w:rPr>
+        <w:t>ALERTE_STOCK_EXPEDITEUR</w:t>
+      </w:r>
+      <w:r>
+        <w:t xml:space="preserve"> (propriété </w:t>
+      </w:r>
+      <w:r>
+        <w:rPr>
+          <w:rStyle w:val="VerbatimChar"/>
+        </w:rPr>
+        <w:t>alerte.stock.expediteur</w:t>
+      </w:r>
+      <w:r>
+        <w:t xml:space="preserve">), vide par défaut. Lorsqu'il est défini, </w:t>
+      </w:r>
+      <w:r>
+        <w:rPr>
+          <w:rStyle w:val="VerbatimChar"/>
+        </w:rPr>
+        <w:t>NotificationServiceImpl</w:t>
+      </w:r>
+      <w:r>
+        <w:t xml:space="preserve"> le place dans l'en-tête « From » du message (</w:t>
+      </w:r>
+      <w:r>
+        <w:rPr>
+          <w:rStyle w:val="VerbatimChar"/>
+        </w:rPr>
+        <w:t>setFrom</w:t>
+      </w:r>
+      <w:r>
+        <w:t>) ; lorsqu'il est vide, aucun expéditeur n'est fixé et le serveur SMTP applique le compte authentifié (</w:t>
+      </w:r>
+      <w:r>
+        <w:rPr>
+          <w:rStyle w:val="VerbatimChar"/>
+        </w:rPr>
+        <w:t>MAIL_USERNAME</w:t>
+      </w:r>
+      <w:r>
+        <w:t>), ce qui était le comportement d'origine.</w:t>
+      </w:r>
+    </w:p>
+    <w:p>
+      <w:pPr>
         <w:pStyle w:val="Titre3"/>
       </w:pPr>
-      <w:bookmarkStart w:id="26" w:name="_c0f8e6fc4d7595d8662b4f5ab528e54aa3351f1"/>
-      <w:r>
+      <w:r>
+        <w:lastRenderedPageBreak/>
         <w:t>5.8 Archivage de la facture PDF côté serveur</w:t>
       </w:r>
       <w:bookmarkEnd w:id="26"/>
@@ -5340,6 +5444,7 @@
       </w:pPr>
       <w:bookmarkStart w:id="27" w:name="_7e541b32afb701afd497b315b2a20f19aa41fab"/>
       <w:r>
+        <w:lastRenderedPageBreak/>
         <w:t>6. Diagramme d'activité — cycle de vente et de réapprovisionnement</w:t>
       </w:r>
       <w:bookmarkEnd w:id="27"/>
@@ -5361,6 +5466,7 @@
         <w:rPr>
           <w:noProof/>
         </w:rPr>
+        <w:lastRenderedPageBreak/>
         <w:drawing>
           <wp:inline distT="0" distB="0" distL="0" distR="0" wp14:anchorId="3569FA61" wp14:editId="3DB71E00">
             <wp:extent cx="5334000" cy="28478275"/>
@@ -5409,6 +5515,7 @@
         <w:pStyle w:val="ImageCaption"/>
       </w:pPr>
       <w:r>
+        <w:lastRenderedPageBreak/>
         <w:t>Diagramme</w:t>
       </w:r>
     </w:p>
@@ -5562,6 +5669,7 @@
       </w:pPr>
       <w:bookmarkStart w:id="30" w:name="_0d76cf150681b2e6363b542f9250c6f2232e357"/>
       <w:r>
+        <w:lastRenderedPageBreak/>
         <w:t>7.2 Tableau de bord</w:t>
       </w:r>
       <w:bookmarkEnd w:id="30"/>
@@ -5763,6 +5871,7 @@
           <w:b/>
           <w:bCs/>
         </w:rPr>
+        <w:lastRenderedPageBreak/>
         <w:t>Graphiques et alertes de stock</w:t>
       </w:r>
     </w:p>
@@ -5877,6 +5986,7 @@
       </w:pPr>
       <w:bookmarkStart w:id="31" w:name="_0b79b4f2367e57366f82d1112de638b05abdc46"/>
       <w:r>
+        <w:lastRenderedPageBreak/>
         <w:t>7.3 Gestion des clients</w:t>
       </w:r>
       <w:bookmarkEnd w:id="31"/>
@@ -6038,7 +6148,11 @@
         <w:pStyle w:val="FirstParagraph"/>
       </w:pPr>
       <w:r>
-        <w:t xml:space="preserve">Formulaire client réutilisé à l'identique pour la création et la modification, avec validations en temps réel (nom et prénom obligatoires, format d'email, téléphone à exactement 10 chiffres). Le message de succès en tête de page (« Client mis à jour avec succès ! ») confirme l'action ; les messages d'erreur sous chaque champ apparaissent uniquement si la validation échoue. Les mêmes règles sont appliquées côté serveur (voir §4.4). Le formulaire n'est affiché qu'aux rôles </w:t>
+        <w:t xml:space="preserve">Formulaire client réutilisé à l'identique pour la création et la modification, avec validations en temps réel (nom et prénom obligatoires, format d'email, téléphone à exactement 10 chiffres). Le message de succès en tête de page (« Client mis à jour avec succès ! ») confirme l'action ; les messages d'erreur sous chaque champ apparaissent uniquement si la validation échoue. Les mêmes règles sont appliquées côté serveur (voir §4.4). Le formulaire </w:t>
+      </w:r>
+      <w:r>
+        <w:lastRenderedPageBreak/>
+        <w:t xml:space="preserve">n'est affiché qu'aux rôles </w:t>
       </w:r>
       <w:r>
         <w:rPr>
@@ -6270,7 +6384,11 @@
         <w:t>caissier</w:t>
       </w:r>
       <w:r>
-        <w:t>. La barre de navigation ne propose que les onglets Clients, Produits et Commandes (pas de tableau de bord, de fournisseurs, d'achats ni de journal d'audit). Le formulaire « Nouveau client » et la colonne Action sont absents : le caissier recherche, consulte et exporte la liste, mais ne peut ni créer, ni modifier, ni supprimer un client, conformément aux règles du serveur (§4.2).</w:t>
+        <w:t xml:space="preserve">. La barre de navigation ne propose que les onglets Clients, Produits et Commandes (pas de tableau de bord, de fournisseurs, d'achats ni de journal d'audit). Le formulaire « Nouveau client » et la colonne Action sont </w:t>
+      </w:r>
+      <w:r>
+        <w:lastRenderedPageBreak/>
+        <w:t>absents : le caissier recherche, consulte et exporte la liste, mais ne peut ni créer, ni modifier, ni supprimer un client, conformément aux règles du serveur (§4.2).</w:t>
       </w:r>
     </w:p>
     <w:p>
@@ -6471,6 +6589,7 @@
           <w:b/>
           <w:bCs/>
         </w:rPr>
+        <w:lastRenderedPageBreak/>
         <w:t>Formulaire — modification</w:t>
       </w:r>
     </w:p>
@@ -6640,6 +6759,7 @@
           <w:b/>
           <w:bCs/>
         </w:rPr>
+        <w:lastRenderedPageBreak/>
         <w:t>Liste des produits</w:t>
       </w:r>
     </w:p>
@@ -6930,6 +7050,7 @@
           <w:b/>
           <w:bCs/>
         </w:rPr>
+        <w:lastRenderedPageBreak/>
         <w:t>Liste des produits — vue caissier</w:t>
       </w:r>
     </w:p>
@@ -6942,7 +7063,7 @@
           <w:noProof/>
         </w:rPr>
         <w:drawing>
-          <wp:inline distT="0" distB="0" distL="0" distR="0" wp14:anchorId="7A8D62EF" wp14:editId="0E11DC69">
+          <wp:inline distT="0" distB="0" distL="0" distR="0" wp14:anchorId="7A8D62EF" wp14:editId="70ED94DF">
             <wp:extent cx="5334000" cy="2268906"/>
             <wp:effectExtent l="0" t="0" r="0" b="0"/>
             <wp:docPr id="1108472297" name="Image 1" descr="Liste des produits vue caissier"/>
@@ -7108,6 +7229,7 @@
           <w:b/>
           <w:bCs/>
         </w:rPr>
+        <w:lastRenderedPageBreak/>
         <w:t>Liste des commandes et facturation</w:t>
       </w:r>
     </w:p>
@@ -7328,6 +7450,7 @@
       </w:pPr>
       <w:bookmarkStart w:id="35" w:name="_5975cb26d92caeb229313bc7acd26b08588ea94"/>
       <w:r>
+        <w:lastRenderedPageBreak/>
         <w:t>7.7 Fournisseurs</w:t>
       </w:r>
       <w:bookmarkEnd w:id="35"/>
@@ -7602,6 +7725,7 @@
           <w:b/>
           <w:bCs/>
         </w:rPr>
+        <w:lastRenderedPageBreak/>
         <w:t>Liste des fournisseurs — vue gestionnaire</w:t>
       </w:r>
     </w:p>
@@ -7614,7 +7738,7 @@
           <w:noProof/>
         </w:rPr>
         <w:drawing>
-          <wp:inline distT="0" distB="0" distL="0" distR="0" wp14:anchorId="3BE33F28" wp14:editId="08039FB0">
+          <wp:inline distT="0" distB="0" distL="0" distR="0" wp14:anchorId="3BE33F28" wp14:editId="30CE2EFE">
             <wp:extent cx="5334000" cy="1684242"/>
             <wp:effectExtent l="0" t="0" r="0" b="0"/>
             <wp:docPr id="783165910" name="Image 1" descr="Liste des fournisseurs vue gestionnaire"/>
@@ -7840,6 +7964,7 @@
         <w:pStyle w:val="FirstParagraph"/>
       </w:pPr>
       <w:r>
+        <w:lastRenderedPageBreak/>
         <w:t xml:space="preserve">Sélection du fournisseur, ajout de produits avec quantité et </w:t>
       </w:r>
       <w:r>
@@ -8010,6 +8135,7 @@
       </w:pPr>
       <w:bookmarkStart w:id="37" w:name="_5e87025747a18e261c6abce4835a7065e163500"/>
       <w:r>
+        <w:lastRenderedPageBreak/>
         <w:t>7.9 Journal d'audit</w:t>
       </w:r>
       <w:bookmarkEnd w:id="37"/>
@@ -8036,40 +8162,40 @@
           <w:noProof/>
         </w:rPr>
         <w:drawing>
-          <wp:inline distT="0" distB="0" distL="0" distR="0" wp14:anchorId="6C70AD99" wp14:editId="39C0BC5F">
-            <wp:extent cx="5334000" cy="2315705"/>
+          <wp:inline distT="0" distB="0" distL="0" distR="0" wp14:anchorId="45F93B4C" wp14:editId="1318930E">
+            <wp:extent cx="5334000" cy="2506515"/>
             <wp:effectExtent l="0" t="0" r="0" b="0"/>
-            <wp:docPr id="152" name="Picture" descr="Journal d'audit"/>
-            <wp:cNvGraphicFramePr/>
+            <wp:docPr id="1354334539" name="Image 1" descr="Journal d'audit"/>
+            <wp:cNvGraphicFramePr>
+              <a:graphicFrameLocks xmlns:a="http://schemas.openxmlformats.org/drawingml/2006/main" noChangeAspect="1"/>
+            </wp:cNvGraphicFramePr>
             <a:graphic xmlns:a="http://schemas.openxmlformats.org/drawingml/2006/main">
               <a:graphicData uri="http://schemas.openxmlformats.org/drawingml/2006/picture">
                 <pic:pic xmlns:pic="http://schemas.openxmlformats.org/drawingml/2006/picture">
                   <pic:nvPicPr>
-                    <pic:cNvPr id="153" name="Picture" descr="../screenshots/Capture%20d'%C3%A9cran%202026-08-08%20202710.png"/>
-                    <pic:cNvPicPr>
-                      <a:picLocks noChangeAspect="1" noChangeArrowheads="1"/>
-                    </pic:cNvPicPr>
+                    <pic:cNvPr id="1354334539" name="Image 1" descr="Journal d'audit"/>
+                    <pic:cNvPicPr/>
                   </pic:nvPicPr>
                   <pic:blipFill>
-                    <a:blip r:embed="rId44"/>
+                    <a:blip r:embed="rId44" cstate="print">
+                      <a:extLst>
+                        <a:ext uri="{28A0092B-C50C-407E-A947-70E740481C1C}">
+                          <a14:useLocalDpi xmlns:a14="http://schemas.microsoft.com/office/drawing/2010/main" val="0"/>
+                        </a:ext>
+                      </a:extLst>
+                    </a:blip>
                     <a:stretch>
                       <a:fillRect/>
                     </a:stretch>
                   </pic:blipFill>
-                  <pic:spPr bwMode="auto">
+                  <pic:spPr>
                     <a:xfrm>
                       <a:off x="0" y="0"/>
-                      <a:ext cx="5334000" cy="2315705"/>
+                      <a:ext cx="5334000" cy="2506515"/>
                     </a:xfrm>
                     <a:prstGeom prst="rect">
                       <a:avLst/>
                     </a:prstGeom>
-                    <a:noFill/>
-                    <a:ln w="9525">
-                      <a:noFill/>
-                      <a:headEnd/>
-                      <a:tailEnd/>
-                    </a:ln>
                   </pic:spPr>
                 </pic:pic>
               </a:graphicData>
@@ -8091,7 +8217,7 @@
         <w:pStyle w:val="FirstParagraph"/>
       </w:pPr>
       <w:r>
-        <w:t xml:space="preserve">Vue paginée de toutes les actions de création, modification et suppression tracées par l'application (69 actions enregistrées sur cette capture), avec la date, l'utilisateur, le type d'action (code couleur : vert pour création, jaune pour modification, rouge pour suppression), l'entité concernée et une description lisible de l'action. Cet écran est réservé au rôle </w:t>
+        <w:t xml:space="preserve">Vue paginée de toutes les actions de création, modification et suppression tracées par l'application (76 actions enregistrées sur cette capture), avec la date, l'utilisateur, le type d'action (code couleur : vert pour création, jaune pour modification, rouge pour suppression), l'entité concernée et une description lisible de l'action. Cet écran est réservé au rôle </w:t>
       </w:r>
       <w:r>
         <w:rPr>
@@ -8131,6 +8257,7 @@
           <w:b/>
           <w:bCs/>
         </w:rPr>
+        <w:lastRenderedPageBreak/>
         <w:t>En-tête d'autorisation JWT (DevTools réseau)</w:t>
       </w:r>
     </w:p>
@@ -8299,6 +8426,7 @@
         <w:rPr>
           <w:noProof/>
         </w:rPr>
+        <w:lastRenderedPageBreak/>
         <w:drawing>
           <wp:inline distT="0" distB="0" distL="0" distR="0" wp14:anchorId="3CE74518" wp14:editId="0F526C69">
             <wp:extent cx="5334000" cy="2510781"/>
@@ -8498,6 +8626,7 @@
       </w:pPr>
       <w:bookmarkStart w:id="39" w:name="_92a8d46865dc0f299cf7e6f6edf4351766a8cf7"/>
       <w:r>
+        <w:lastRenderedPageBreak/>
         <w:t>7.11 Couverture de tests automatisés</w:t>
       </w:r>
       <w:bookmarkEnd w:id="39"/>
@@ -8965,20 +9094,29 @@
               <w:pStyle w:val="Compact"/>
             </w:pPr>
             <w:r>
-              <w:t>2</w:t>
-            </w:r>
-          </w:p>
-        </w:tc>
-        <w:tc>
-          <w:tcPr>
-            <w:tcW w:w="0" w:type="auto"/>
-          </w:tcPr>
-          <w:p>
-            <w:pPr>
-              <w:pStyle w:val="Compact"/>
-            </w:pPr>
-            <w:r>
-              <w:t>Aucun email envoyé si la liste de ruptures est vide ; séparation de l'email entre « rupture imminente » (moins de 5) et « stock bas » (5 à 9)</w:t>
+              <w:t>4</w:t>
+            </w:r>
+          </w:p>
+        </w:tc>
+        <w:tc>
+          <w:tcPr>
+            <w:tcW w:w="0" w:type="auto"/>
+          </w:tcPr>
+          <w:p>
+            <w:pPr>
+              <w:pStyle w:val="Compact"/>
+            </w:pPr>
+            <w:r>
+              <w:t xml:space="preserve">Aucun email envoyé si la liste de ruptures est vide ; séparation de l'email entre « rupture imminente » (moins de 5) et « stock bas » (5 à 9) ; expéditeur renseigné quand </w:t>
+            </w:r>
+            <w:r>
+              <w:rPr>
+                <w:rStyle w:val="VerbatimChar"/>
+              </w:rPr>
+              <w:t>alerte.stock.expediteur</w:t>
+            </w:r>
+            <w:r>
+              <w:t xml:space="preserve"> est défini, absent quand elle est vide</w:t>
             </w:r>
           </w:p>
         </w:tc>
@@ -8991,47 +9129,41 @@
           <w:p>
             <w:pPr>
               <w:pStyle w:val="Compact"/>
-            </w:pPr>
-            <w:r>
-              <w:rPr>
-                <w:rStyle w:val="VerbatimChar"/>
-              </w:rPr>
-              <w:t>SecurityAutorisationsTest</w:t>
-            </w:r>
-          </w:p>
-        </w:tc>
-        <w:tc>
-          <w:tcPr>
-            <w:tcW w:w="0" w:type="auto"/>
-          </w:tcPr>
-          <w:p>
-            <w:pPr>
-              <w:pStyle w:val="Compact"/>
-            </w:pPr>
-            <w:r>
-              <w:t>15</w:t>
-            </w:r>
-          </w:p>
-        </w:tc>
-        <w:tc>
-          <w:tcPr>
-            <w:tcW w:w="0" w:type="auto"/>
-          </w:tcPr>
-          <w:p>
-            <w:pPr>
-              <w:pStyle w:val="Compact"/>
-            </w:pPr>
-            <w:r>
-              <w:t>Matrice des droits de §4.2, rôle par rôle (</w:t>
-            </w:r>
-            <w:r>
-              <w:rPr>
-                <w:rStyle w:val="VerbatimChar"/>
-              </w:rPr>
-              <w:t>@WithMockUser</w:t>
-            </w:r>
-            <w:r>
-              <w:t>), sur la base H2 de test : refus 403 des actions interdites, accès aux actions permises, refus sans authentification, seeder inactif en test</w:t>
+              <w:rPr>
+                <w:rStyle w:val="VerbatimChar"/>
+              </w:rPr>
+            </w:pPr>
+            <w:r>
+              <w:rPr>
+                <w:rStyle w:val="VerbatimChar"/>
+              </w:rPr>
+              <w:t>MontantFcfaTest</w:t>
+            </w:r>
+          </w:p>
+        </w:tc>
+        <w:tc>
+          <w:tcPr>
+            <w:tcW w:w="0" w:type="auto"/>
+          </w:tcPr>
+          <w:p>
+            <w:pPr>
+              <w:pStyle w:val="Compact"/>
+            </w:pPr>
+            <w:r>
+              <w:t>2</w:t>
+            </w:r>
+          </w:p>
+        </w:tc>
+        <w:tc>
+          <w:tcPr>
+            <w:tcW w:w="0" w:type="auto"/>
+          </w:tcPr>
+          <w:p>
+            <w:pPr>
+              <w:pStyle w:val="Compact"/>
+            </w:pPr>
+            <w:r>
+              <w:t>Même format pour une vente (« 400000.00 ») et un achat (« 1500000 ») : « 400 000 FCFA », « 1 500 000 FCFA » ; arrondi, zéro et montant négatif</w:t>
             </w:r>
           </w:p>
         </w:tc>
@@ -9044,14 +9176,72 @@
           <w:p>
             <w:pPr>
               <w:pStyle w:val="Compact"/>
-              <w:rPr>
-                <w:rStyle w:val="VerbatimChar"/>
-              </w:rPr>
-            </w:pPr>
-            <w:r>
-              <w:rPr>
-                <w:rStyle w:val="VerbatimChar"/>
-              </w:rPr>
+            </w:pPr>
+            <w:r>
+              <w:rPr>
+                <w:rStyle w:val="VerbatimChar"/>
+              </w:rPr>
+              <w:t>SecurityAutorisationsTest</w:t>
+            </w:r>
+          </w:p>
+        </w:tc>
+        <w:tc>
+          <w:tcPr>
+            <w:tcW w:w="0" w:type="auto"/>
+          </w:tcPr>
+          <w:p>
+            <w:pPr>
+              <w:pStyle w:val="Compact"/>
+            </w:pPr>
+            <w:r>
+              <w:t>15</w:t>
+            </w:r>
+          </w:p>
+        </w:tc>
+        <w:tc>
+          <w:tcPr>
+            <w:tcW w:w="0" w:type="auto"/>
+          </w:tcPr>
+          <w:p>
+            <w:pPr>
+              <w:pStyle w:val="Compact"/>
+            </w:pPr>
+            <w:r>
+              <w:t xml:space="preserve">Matrice des droits de §4.2, rôle par rôle </w:t>
+            </w:r>
+            <w:r>
+              <w:lastRenderedPageBreak/>
+              <w:t>(</w:t>
+            </w:r>
+            <w:r>
+              <w:rPr>
+                <w:rStyle w:val="VerbatimChar"/>
+              </w:rPr>
+              <w:t>@WithMockUser</w:t>
+            </w:r>
+            <w:r>
+              <w:t>), sur la base H2 de test : refus 403 des actions interdites, accès aux actions permises, refus sans authentification, seeder inactif en test</w:t>
+            </w:r>
+          </w:p>
+        </w:tc>
+      </w:tr>
+      <w:tr>
+        <w:tc>
+          <w:tcPr>
+            <w:tcW w:w="0" w:type="auto"/>
+          </w:tcPr>
+          <w:p>
+            <w:pPr>
+              <w:pStyle w:val="Compact"/>
+              <w:rPr>
+                <w:rStyle w:val="VerbatimChar"/>
+              </w:rPr>
+            </w:pPr>
+            <w:r>
+              <w:rPr>
+                <w:rStyle w:val="VerbatimChar"/>
+              </w:rPr>
+              <w:lastRenderedPageBreak/>
               <w:t>OpenApiConfigTest</w:t>
             </w:r>
           </w:p>
@@ -9125,7 +9315,7 @@
         <w:t>mvn test</w:t>
       </w:r>
       <w:r>
-        <w:t xml:space="preserve">), la suite backend passe : 35 tests, tous au vert. Ce total inclut aussi </w:t>
+        <w:t xml:space="preserve">), la suite backend passe : 39 tests, tous au vert. Ce total inclut aussi </w:t>
       </w:r>
       <w:r>
         <w:rPr>
@@ -9360,6 +9550,7 @@
           <w:b/>
           <w:bCs/>
         </w:rPr>
+        <w:lastRenderedPageBreak/>
         <w:t>Isolation du job planifié (</w:t>
       </w:r>
       <w:r>
@@ -9762,7 +9953,11 @@
         <w:t>StatutCommande</w:t>
       </w:r>
       <w:r>
-        <w:t xml:space="preserve"> (ajouté après coup), la colonne a volontairement été laissée nullable, et le service traite une valeur </w:t>
+        <w:t xml:space="preserve"> (ajouté après coup), la colonne a volontairement été laissée </w:t>
+      </w:r>
+      <w:r>
+        <w:lastRenderedPageBreak/>
+        <w:t xml:space="preserve">nullable, et le service traite une valeur </w:t>
       </w:r>
       <w:r>
         <w:rPr>
@@ -10055,6 +10250,7 @@
           <w:b/>
           <w:bCs/>
         </w:rPr>
+        <w:lastRenderedPageBreak/>
         <w:t>Test unitaire d'un calcul dépendant du temps</w:t>
       </w:r>
       <w:r>
@@ -10313,6 +10509,7 @@
     </w:p>
     <w:p>
       <w:r>
+        <w:lastRenderedPageBreak/>
         <w:pict w14:anchorId="7C20024C">
           <v:rect id="_x0000_i1035" style="width:0;height:1.5pt" o:hralign="center" o:hrstd="t" o:hr="t"/>
         </w:pict>

</xml_diff>